<commit_message>
Cấu trúc lại toàn bộ architecture và di chuyển file về đúng vị trí
</commit_message>
<xml_diff>
--- a/Document/Developer resources.docx
+++ b/Document/Developer resources.docx
@@ -621,6 +621,44 @@
     <w:p>
       <w:r>
         <w:t>Người khổng lồ tích nộ qua Effect</w:t>
+      </w:r>
+    </w:p>
+    <w:p>
+      <w:pPr>
+        <w:pStyle w:val="Heading1"/>
+      </w:pPr>
+      <w:r>
+        <w:lastRenderedPageBreak/>
+        <w:t>Architecture mới:</w:t>
+      </w:r>
+    </w:p>
+    <w:p>
+      <w:pPr>
+        <w:pStyle w:val="Heading2"/>
+      </w:pPr>
+      <w:r>
+        <w:t>Core</w:t>
+      </w:r>
+    </w:p>
+    <w:p>
+      <w:r>
+        <w:t>Chỉ chứa các abstract class</w:t>
+      </w:r>
+    </w:p>
+    <w:p>
+      <w:pPr>
+        <w:pStyle w:val="Heading2"/>
+      </w:pPr>
+      <w:r>
+        <w:t>Entity</w:t>
+      </w:r>
+    </w:p>
+    <w:p>
+      <w:pPr>
+        <w:pStyle w:val="Heading2"/>
+      </w:pPr>
+      <w:r>
+        <w:t>Application</w:t>
       </w:r>
     </w:p>
     <w:sectPr>

</xml_diff>